<commit_message>
docs: fill in the whole GitHub × Codex worksheet
Adds the answer to question 1, the requirements in the Task 7 prompts,
the reason for choosing the plan, the learning reflections, and the
evidence images (real command output and screenshots of the game
before and after). Task 8 and Task 10 now include the teammate's
investment and auction features (51 tests, about +60%). Fork homepage
and Codex conversation screenshots are left for the student.

Co-Authored-By: Claude Opus 5.5 <noreply@anthropic.com>
Claude-Session: https://claude.ai/code/session_01GESoAsY3MXi1qxwZNdZBJa
</commit_message>
<xml_diff>
--- a/docs/GitHub-Codex-作業單.docx
+++ b/docs/GitHub-Codex-作業單.docx
@@ -676,7 +676,7 @@
         <w:pStyle w:val="af"/>
       </w:pPr>
       <w:r>
-        <w:t>作答：____________________________________________________________________________</w:t>
+        <w:t>作答：USB 備份只是另一份檔案，看不出改了哪裡、為什麼改，也很難回到某一個版本。Git 會把每次修改記成有說明的 commit，可以用 git diff 比較差異、退回舊版本，也能開分支試做新功能而不影響 main，多人還能各自在分支上開發再合併。這次作業我把新功能放在 feature/my-improvement 分支，和 main 的原作品分開，用 PR 看兩者的差異；出問題時也能從 commit 紀錄找出是哪一次改動造成的再修正。</w:t>
       </w:r>
     </w:p>
     <w:p>
@@ -2489,6 +2489,22 @@
       </w:r>
     </w:p>
     <w:p>
+      <w:r>
+        <w:rPr>
+          <w:b/>
+          <w:sz w:val="18"/>
+        </w:rPr>
+        <w:t>紀錄：</w:t>
+      </w:r>
+      <w:r>
+        <w:rPr>
+          <w:color w:val="556066"/>
+          <w:sz w:val="18"/>
+        </w:rPr>
+        <w:t>GitHub 查詢結果：soymilk0211/bigdata-week7 是 Fork（fork: true）、公開的 Repo，預設分支是 main，已開啟 GitHub Pages。Fork 首頁的畫面要登入 GitHub 才能擷取，請本人補上截圖。</w:t>
+      </w:r>
+    </w:p>
+    <w:p>
       <w:pPr>
         <w:pStyle w:val="af"/>
         <w:rPr>
@@ -2814,6 +2830,51 @@
       </w:r>
       <w:r>
         <w:t xml:space="preserve"> 截圖終端機的 git remote -v 與 git status（或 Codex 呈現的執行結果）。</w:t>
+      </w:r>
+    </w:p>
+    <w:p>
+      <w:r>
+        <w:drawing>
+          <wp:inline xmlns:a="http://schemas.openxmlformats.org/drawingml/2006/main" xmlns:pic="http://schemas.openxmlformats.org/drawingml/2006/picture">
+            <wp:extent cx="5852160" cy="1678017"/>
+            <wp:docPr id="1135014464" name="Picture 1135014464"/>
+            <wp:cNvGraphicFramePr>
+              <a:graphicFrameLocks noChangeAspect="1"/>
+            </wp:cNvGraphicFramePr>
+            <a:graphic>
+              <a:graphicData uri="http://schemas.openxmlformats.org/drawingml/2006/picture">
+                <pic:pic>
+                  <pic:nvPicPr>
+                    <pic:cNvPr id="0" name="ev2-remote-status.png"/>
+                    <pic:cNvPicPr/>
+                  </pic:nvPicPr>
+                  <pic:blipFill>
+                    <a:blip r:embed="rId16"/>
+                    <a:stretch>
+                      <a:fillRect/>
+                    </a:stretch>
+                  </pic:blipFill>
+                  <pic:spPr>
+                    <a:xfrm>
+                      <a:off x="0" y="0"/>
+                      <a:ext cx="5852160" cy="1678017"/>
+                    </a:xfrm>
+                    <a:prstGeom prst="rect"/>
+                  </pic:spPr>
+                </pic:pic>
+              </a:graphicData>
+            </a:graphic>
+          </wp:inline>
+        </w:drawing>
+      </w:r>
+    </w:p>
+    <w:p>
+      <w:r>
+        <w:rPr>
+          <w:color w:val="556066"/>
+          <w:sz w:val="18"/>
+        </w:rPr>
+        <w:t>實際執行結果：origin 指向自己的 Fork（github.com/soymilk0211/bigdata-week7），目前在 feature/my-improvement 分支，和 GitHub 上的版本一致，沒有未提交的修改。</w:t>
       </w:r>
     </w:p>
     <w:p>
@@ -3286,6 +3347,51 @@
       </w:r>
     </w:p>
     <w:p>
+      <w:r>
+        <w:drawing>
+          <wp:inline xmlns:a="http://schemas.openxmlformats.org/drawingml/2006/main" xmlns:pic="http://schemas.openxmlformats.org/drawingml/2006/picture">
+            <wp:extent cx="5852160" cy="2119915"/>
+            <wp:docPr id="1135014465" name="Picture 1135014465"/>
+            <wp:cNvGraphicFramePr>
+              <a:graphicFrameLocks noChangeAspect="1"/>
+            </wp:cNvGraphicFramePr>
+            <a:graphic>
+              <a:graphicData uri="http://schemas.openxmlformats.org/drawingml/2006/picture">
+                <pic:pic>
+                  <pic:nvPicPr>
+                    <pic:cNvPr id="0" name="ev3-structure.png"/>
+                    <pic:cNvPicPr/>
+                  </pic:nvPicPr>
+                  <pic:blipFill>
+                    <a:blip r:embed="rId17"/>
+                    <a:stretch>
+                      <a:fillRect/>
+                    </a:stretch>
+                  </pic:blipFill>
+                  <pic:spPr>
+                    <a:xfrm>
+                      <a:off x="0" y="0"/>
+                      <a:ext cx="5852160" cy="2119915"/>
+                    </a:xfrm>
+                    <a:prstGeom prst="rect"/>
+                  </pic:spPr>
+                </pic:pic>
+              </a:graphicData>
+            </a:graphic>
+          </wp:inline>
+        </w:drawing>
+      </w:r>
+    </w:p>
+    <w:p>
+      <w:r>
+        <w:rPr>
+          <w:color w:val="556066"/>
+          <w:sz w:val="18"/>
+        </w:rPr>
+        <w:t>原始範本的檔案：index.html（頁面）、app.js（介面）、engine.js（拉霸、回合、事件與結算的規則引擎）、data.js（10 種企業、事件卡與聯準會規則）、sync.js（多頁籤同步）、styles.css、build.mjs（把來源檔合併成 game.js）、serve.mjs（本機伺服器）、engine.test.js／sync.test.js（測試）。Codex 說明架構的對話請本人從 Codex 補上截圖。</w:t>
+      </w:r>
+    </w:p>
+    <w:p>
       <w:pPr>
         <w:spacing w:after="200" w:line="276" w:lineRule="auto"/>
         <w:rPr>
@@ -3507,6 +3613,87 @@
           <w:lang w:eastAsia="zh-TW"/>
         </w:rPr>
         <w:t>的簡短紀錄。</w:t>
+      </w:r>
+    </w:p>
+    <w:p>
+      <w:r>
+        <w:drawing>
+          <wp:inline xmlns:a="http://schemas.openxmlformats.org/drawingml/2006/main" xmlns:pic="http://schemas.openxmlformats.org/drawingml/2006/picture">
+            <wp:extent cx="5852160" cy="3657600"/>
+            <wp:docPr id="1135014466" name="Picture 1135014466"/>
+            <wp:cNvGraphicFramePr>
+              <a:graphicFrameLocks noChangeAspect="1"/>
+            </wp:cNvGraphicFramePr>
+            <a:graphic>
+              <a:graphicData uri="http://schemas.openxmlformats.org/drawingml/2006/picture">
+                <pic:pic>
+                  <pic:nvPicPr>
+                    <pic:cNvPr id="0" name="ev4-before-home.png"/>
+                    <pic:cNvPicPr/>
+                  </pic:nvPicPr>
+                  <pic:blipFill>
+                    <a:blip r:embed="rId18"/>
+                    <a:stretch>
+                      <a:fillRect/>
+                    </a:stretch>
+                  </pic:blipFill>
+                  <pic:spPr>
+                    <a:xfrm>
+                      <a:off x="0" y="0"/>
+                      <a:ext cx="5852160" cy="3657600"/>
+                    </a:xfrm>
+                    <a:prstGeom prst="rect"/>
+                  </pic:spPr>
+                </pic:pic>
+              </a:graphicData>
+            </a:graphic>
+          </wp:inline>
+        </w:drawing>
+      </w:r>
+    </w:p>
+    <w:p>
+      <w:r>
+        <w:drawing>
+          <wp:inline xmlns:a="http://schemas.openxmlformats.org/drawingml/2006/main" xmlns:pic="http://schemas.openxmlformats.org/drawingml/2006/picture">
+            <wp:extent cx="5852160" cy="3657600"/>
+            <wp:docPr id="1135014467" name="Picture 1135014467"/>
+            <wp:cNvGraphicFramePr>
+              <a:graphicFrameLocks noChangeAspect="1"/>
+            </wp:cNvGraphicFramePr>
+            <a:graphic>
+              <a:graphicData uri="http://schemas.openxmlformats.org/drawingml/2006/picture">
+                <pic:pic>
+                  <pic:nvPicPr>
+                    <pic:cNvPr id="0" name="ev4-before-game.png"/>
+                    <pic:cNvPicPr/>
+                  </pic:nvPicPr>
+                  <pic:blipFill>
+                    <a:blip r:embed="rId19"/>
+                    <a:stretch>
+                      <a:fillRect/>
+                    </a:stretch>
+                  </pic:blipFill>
+                  <pic:spPr>
+                    <a:xfrm>
+                      <a:off x="0" y="0"/>
+                      <a:ext cx="5852160" cy="3657600"/>
+                    </a:xfrm>
+                    <a:prstGeom prst="rect"/>
+                  </pic:spPr>
+                </pic:pic>
+              </a:graphicData>
+            </a:graphic>
+          </wp:inline>
+        </w:drawing>
+      </w:r>
+    </w:p>
+    <w:p>
+      <w:r>
+        <w:rPr>
+          <w:color w:val="556066"/>
+          <w:sz w:val="18"/>
+        </w:rPr>
+        <w:t>修改前（main 分支的原作品）：直接開啟 index.html（或執行 node serve.mjs 後打開 http://127.0.0.1:4173/），首頁按「設定玩家，開始遊戲」，選 2–8 位玩家和企業後開始。所有人在同一台電腦輪流按「啟動拉霸」、抽事件卡、聘僱或借款經營，全部人完成後結算一季。只能在同一台裝置輪流操作，不能用自己的手機加入。</w:t>
       </w:r>
     </w:p>
     <w:p>
@@ -4027,6 +4214,51 @@
       </w:r>
     </w:p>
     <w:p>
+      <w:r>
+        <w:drawing>
+          <wp:inline xmlns:a="http://schemas.openxmlformats.org/drawingml/2006/main" xmlns:pic="http://schemas.openxmlformats.org/drawingml/2006/picture">
+            <wp:extent cx="5852160" cy="1391381"/>
+            <wp:docPr id="1135014468" name="Picture 1135014468"/>
+            <wp:cNvGraphicFramePr>
+              <a:graphicFrameLocks noChangeAspect="1"/>
+            </wp:cNvGraphicFramePr>
+            <a:graphic>
+              <a:graphicData uri="http://schemas.openxmlformats.org/drawingml/2006/picture">
+                <pic:pic>
+                  <pic:nvPicPr>
+                    <pic:cNvPr id="0" name="ev5-branches.png"/>
+                    <pic:cNvPicPr/>
+                  </pic:nvPicPr>
+                  <pic:blipFill>
+                    <a:blip r:embed="rId20"/>
+                    <a:stretch>
+                      <a:fillRect/>
+                    </a:stretch>
+                  </pic:blipFill>
+                  <pic:spPr>
+                    <a:xfrm>
+                      <a:off x="0" y="0"/>
+                      <a:ext cx="5852160" cy="1391381"/>
+                    </a:xfrm>
+                    <a:prstGeom prst="rect"/>
+                  </pic:spPr>
+                </pic:pic>
+              </a:graphicData>
+            </a:graphic>
+          </wp:inline>
+        </w:drawing>
+      </w:r>
+    </w:p>
+    <w:p>
+      <w:r>
+        <w:rPr>
+          <w:color w:val="556066"/>
+          <w:sz w:val="18"/>
+        </w:rPr>
+        <w:t>GitHub 上的分支：main（原作品，留給 PR 比較用）、feature/my-improvement（本次改良，GitHub Pages 從這裡部署）。另外有組員開發投資與競標用的 feature/investment-auction 和合併前的備份分支，以及 AI 工具工作用的 claude/room-connection-timeout-l24xbb。</w:t>
+      </w:r>
+    </w:p>
+    <w:p>
       <w:pPr>
         <w:spacing w:after="200" w:line="276" w:lineRule="auto"/>
         <w:rPr>
@@ -4522,6 +4754,18 @@
       </w:r>
     </w:p>
     <w:p>
+      <w:r>
+        <w:rPr>
+          <w:b/>
+          <w:sz w:val="21"/>
+        </w:rPr>
+        <w:t>選擇方案的原因：</w:t>
+      </w:r>
+      <w:r>
+        <w:t>原作品只能大家擠在同一台電腦輪流玩，但上課時每個人都有手機，所以改良 A 選「多人連線」，讓每個人用自己的手機加入同一局。實際用手機測試時，發現連不上時畫面會一直停在「正在連線…」、玩家資料太擠也看不出哪個是自己，所以改良 B 選連線錯誤處理和畫面精簡。（Codex 提供的候選方案請本人從 Codex 補上截圖。）</w:t>
+      </w:r>
+    </w:p>
+    <w:p>
       <w:pPr>
         <w:spacing w:after="200" w:line="276" w:lineRule="auto"/>
         <w:rPr>
@@ -4602,7 +4846,7 @@
         <w:rPr>
           <w:lang w:eastAsia="zh-TW"/>
         </w:rPr>
-        <w:t>我選擇的改良 A 是：「【填入功能需求】」。請先確認要修改的檔案，保留原有功能，再實作這一項改良。完成後請說明改動了哪些檔案、如何操作新功能，以及應做哪些測試。不要同時實作改良 B，也不要 Commit 或 Push。</w:t>
+        <w:t>我選擇的改良 A 是：「新增「多人連線」：房主建立 5 碼房間代碼和邀請連結，其他人用自己的手機加入同一局；進房後每個人輸入名字、選一家企業（同一家只能一個人選），房主隨時可以開始，開始後每台裝置只能操作自己的企業」。請先確認要修改的檔案，保留原有功能，再實作這一項改良。完成後請說明改動了哪些檔案、如何操作新功能，以及應做哪些測試。不要同時實作改良 B，也不要 Commit 或 Push。</w:t>
       </w:r>
     </w:p>
     <w:p>
@@ -4638,7 +4882,7 @@
         <w:rPr>
           <w:lang w:eastAsia="zh-TW"/>
         </w:rPr>
-        <w:t>改良 A 已完成。請在不破壞現有功能的前提下完成改良 B：「【填入易用性／品質需求】」。請保留清楚的 UI 文字、錯誤處理或響應式設計；完成後列出變更清單、潛在副作用與驗證步驟。不要自行 Commit 或 Push。</w:t>
+        <w:t>改良 A 已完成。請在不破壞現有功能的前提下完成改良 B：「改善多人連線的穩定性和畫面：連不上時 15 秒內顯示原因並建議改用手機熱點；房主暫時斷線時保留房間和代碼並自動重連；玩家區只顯示自己的完整資料，其他人改用淨資產排行」。請保留清楚的 UI 文字、錯誤處理或響應式設計；完成後列出變更清單、潛在副作用與驗證步驟。不要自行 Commit 或 Push。</w:t>
       </w:r>
     </w:p>
     <w:p>
@@ -4708,6 +4952,370 @@
           <w:lang w:eastAsia="zh-TW"/>
         </w:rPr>
         <w:t xml:space="preserve"> 改良 A 操作截圖、改良 B 操作截圖、至少 1 張 Git diff 或修改檔案清單截圖。</w:t>
+      </w:r>
+    </w:p>
+    <w:p>
+      <w:pPr>
+        <w:keepNext/>
+      </w:pPr>
+      <w:r>
+        <w:rPr>
+          <w:b/>
+          <w:sz w:val="21"/>
+        </w:rPr>
+        <w:t>改良 A：多人連線</w:t>
+      </w:r>
+    </w:p>
+    <w:p>
+      <w:r>
+        <w:drawing>
+          <wp:inline xmlns:a="http://schemas.openxmlformats.org/drawingml/2006/main" xmlns:pic="http://schemas.openxmlformats.org/drawingml/2006/picture">
+            <wp:extent cx="1554480" cy="3364054"/>
+            <wp:docPr id="1135014469" name="Picture 1135014469"/>
+            <wp:cNvGraphicFramePr>
+              <a:graphicFrameLocks noChangeAspect="1"/>
+            </wp:cNvGraphicFramePr>
+            <a:graphic>
+              <a:graphicData uri="http://schemas.openxmlformats.org/drawingml/2006/picture">
+                <pic:pic>
+                  <pic:nvPicPr>
+                    <pic:cNvPr id="0" name="ev7a-home.png"/>
+                    <pic:cNvPicPr/>
+                  </pic:nvPicPr>
+                  <pic:blipFill>
+                    <a:blip r:embed="rId21"/>
+                    <a:stretch>
+                      <a:fillRect/>
+                    </a:stretch>
+                  </pic:blipFill>
+                  <pic:spPr>
+                    <a:xfrm>
+                      <a:off x="0" y="0"/>
+                      <a:ext cx="1554480" cy="3364054"/>
+                    </a:xfrm>
+                    <a:prstGeom prst="rect"/>
+                  </pic:spPr>
+                </pic:pic>
+              </a:graphicData>
+            </a:graphic>
+          </wp:inline>
+        </w:drawing>
+      </w:r>
+      <w:r>
+        <w:t xml:space="preserve">  </w:t>
+      </w:r>
+      <w:r>
+        <w:drawing>
+          <wp:inline xmlns:a="http://schemas.openxmlformats.org/drawingml/2006/main" xmlns:pic="http://schemas.openxmlformats.org/drawingml/2006/picture">
+            <wp:extent cx="1554480" cy="3364054"/>
+            <wp:docPr id="1135014470" name="Picture 1135014470"/>
+            <wp:cNvGraphicFramePr>
+              <a:graphicFrameLocks noChangeAspect="1"/>
+            </wp:cNvGraphicFramePr>
+            <a:graphic>
+              <a:graphicData uri="http://schemas.openxmlformats.org/drawingml/2006/picture">
+                <pic:pic>
+                  <pic:nvPicPr>
+                    <pic:cNvPr id="0" name="ev7a-host-lobby.png"/>
+                    <pic:cNvPicPr/>
+                  </pic:nvPicPr>
+                  <pic:blipFill>
+                    <a:blip r:embed="rId22"/>
+                    <a:stretch>
+                      <a:fillRect/>
+                    </a:stretch>
+                  </pic:blipFill>
+                  <pic:spPr>
+                    <a:xfrm>
+                      <a:off x="0" y="0"/>
+                      <a:ext cx="1554480" cy="3364054"/>
+                    </a:xfrm>
+                    <a:prstGeom prst="rect"/>
+                  </pic:spPr>
+                </pic:pic>
+              </a:graphicData>
+            </a:graphic>
+          </wp:inline>
+        </w:drawing>
+      </w:r>
+      <w:r>
+        <w:t xml:space="preserve">  </w:t>
+      </w:r>
+      <w:r>
+        <w:drawing>
+          <wp:inline xmlns:a="http://schemas.openxmlformats.org/drawingml/2006/main" xmlns:pic="http://schemas.openxmlformats.org/drawingml/2006/picture">
+            <wp:extent cx="1554480" cy="3364054"/>
+            <wp:docPr id="1135014471" name="Picture 1135014471"/>
+            <wp:cNvGraphicFramePr>
+              <a:graphicFrameLocks noChangeAspect="1"/>
+            </wp:cNvGraphicFramePr>
+            <a:graphic>
+              <a:graphicData uri="http://schemas.openxmlformats.org/drawingml/2006/picture">
+                <pic:pic>
+                  <pic:nvPicPr>
+                    <pic:cNvPr id="0" name="ev7a-guest-lobby.png"/>
+                    <pic:cNvPicPr/>
+                  </pic:nvPicPr>
+                  <pic:blipFill>
+                    <a:blip r:embed="rId23"/>
+                    <a:stretch>
+                      <a:fillRect/>
+                    </a:stretch>
+                  </pic:blipFill>
+                  <pic:spPr>
+                    <a:xfrm>
+                      <a:off x="0" y="0"/>
+                      <a:ext cx="1554480" cy="3364054"/>
+                    </a:xfrm>
+                    <a:prstGeom prst="rect"/>
+                  </pic:spPr>
+                </pic:pic>
+              </a:graphicData>
+            </a:graphic>
+          </wp:inline>
+        </w:drawing>
+      </w:r>
+    </w:p>
+    <w:p>
+      <w:r>
+        <w:rPr>
+          <w:color w:val="556066"/>
+          <w:sz w:val="18"/>
+        </w:rPr>
+        <w:t>左：首頁分成「一台裝置輪流玩」和「多人連線」兩個入口。中：房主建立房間，拿到房間代碼，輸入名字並選企業。右：另一台裝置用代碼加入，別人選走的企業會變灰。</w:t>
+      </w:r>
+    </w:p>
+    <w:p>
+      <w:r>
+        <w:drawing>
+          <wp:inline xmlns:a="http://schemas.openxmlformats.org/drawingml/2006/main" xmlns:pic="http://schemas.openxmlformats.org/drawingml/2006/picture">
+            <wp:extent cx="1737360" cy="3759825"/>
+            <wp:docPr id="1135014472" name="Picture 1135014472"/>
+            <wp:cNvGraphicFramePr>
+              <a:graphicFrameLocks noChangeAspect="1"/>
+            </wp:cNvGraphicFramePr>
+            <a:graphic>
+              <a:graphicData uri="http://schemas.openxmlformats.org/drawingml/2006/picture">
+                <pic:pic>
+                  <pic:nvPicPr>
+                    <pic:cNvPr id="0" name="ev7a-guest-game.png"/>
+                    <pic:cNvPicPr/>
+                  </pic:nvPicPr>
+                  <pic:blipFill>
+                    <a:blip r:embed="rId24"/>
+                    <a:stretch>
+                      <a:fillRect/>
+                    </a:stretch>
+                  </pic:blipFill>
+                  <pic:spPr>
+                    <a:xfrm>
+                      <a:off x="0" y="0"/>
+                      <a:ext cx="1737360" cy="3759825"/>
+                    </a:xfrm>
+                    <a:prstGeom prst="rect"/>
+                  </pic:spPr>
+                </pic:pic>
+              </a:graphicData>
+            </a:graphic>
+          </wp:inline>
+        </w:drawing>
+      </w:r>
+      <w:r>
+        <w:t xml:space="preserve">  </w:t>
+      </w:r>
+      <w:r>
+        <w:drawing>
+          <wp:inline xmlns:a="http://schemas.openxmlformats.org/drawingml/2006/main" xmlns:pic="http://schemas.openxmlformats.org/drawingml/2006/picture">
+            <wp:extent cx="1737360" cy="3421337"/>
+            <wp:docPr id="1135014473" name="Picture 1135014473"/>
+            <wp:cNvGraphicFramePr>
+              <a:graphicFrameLocks noChangeAspect="1"/>
+            </wp:cNvGraphicFramePr>
+            <a:graphic>
+              <a:graphicData uri="http://schemas.openxmlformats.org/drawingml/2006/picture">
+                <pic:pic>
+                  <pic:nvPicPr>
+                    <pic:cNvPr id="0" name="ev7a-guest-ranking.png"/>
+                    <pic:cNvPicPr/>
+                  </pic:nvPicPr>
+                  <pic:blipFill>
+                    <a:blip r:embed="rId25"/>
+                    <a:stretch>
+                      <a:fillRect/>
+                    </a:stretch>
+                  </pic:blipFill>
+                  <pic:spPr>
+                    <a:xfrm>
+                      <a:off x="0" y="0"/>
+                      <a:ext cx="1737360" cy="3421337"/>
+                    </a:xfrm>
+                    <a:prstGeom prst="rect"/>
+                  </pic:spPr>
+                </pic:pic>
+              </a:graphicData>
+            </a:graphic>
+          </wp:inline>
+        </w:drawing>
+      </w:r>
+    </w:p>
+    <w:p>
+      <w:r>
+        <w:rPr>
+          <w:color w:val="556066"/>
+          <w:sz w:val="18"/>
+        </w:rPr>
+        <w:t>房主按「開始遊戲」後，每台裝置自動對應自己選的企業（上方顯示「你：小明」）。玩家區只顯示自己的完整資料，其他人只出現在「淨資產排行」。</w:t>
+      </w:r>
+    </w:p>
+    <w:p>
+      <w:pPr>
+        <w:keepNext/>
+      </w:pPr>
+      <w:r>
+        <w:rPr>
+          <w:b/>
+          <w:sz w:val="21"/>
+        </w:rPr>
+        <w:t>改良 B：連線錯誤處理與畫面精簡</w:t>
+      </w:r>
+    </w:p>
+    <w:p>
+      <w:r>
+        <w:drawing>
+          <wp:inline xmlns:a="http://schemas.openxmlformats.org/drawingml/2006/main" xmlns:pic="http://schemas.openxmlformats.org/drawingml/2006/picture">
+            <wp:extent cx="1737360" cy="3759825"/>
+            <wp:docPr id="1135014474" name="Picture 1135014474"/>
+            <wp:cNvGraphicFramePr>
+              <a:graphicFrameLocks noChangeAspect="1"/>
+            </wp:cNvGraphicFramePr>
+            <a:graphic>
+              <a:graphicData uri="http://schemas.openxmlformats.org/drawingml/2006/picture">
+                <pic:pic>
+                  <pic:nvPicPr>
+                    <pic:cNvPr id="0" name="ev7b-p2p-failed.png"/>
+                    <pic:cNvPicPr/>
+                  </pic:nvPicPr>
+                  <pic:blipFill>
+                    <a:blip r:embed="rId26"/>
+                    <a:stretch>
+                      <a:fillRect/>
+                    </a:stretch>
+                  </pic:blipFill>
+                  <pic:spPr>
+                    <a:xfrm>
+                      <a:off x="0" y="0"/>
+                      <a:ext cx="1737360" cy="3759825"/>
+                    </a:xfrm>
+                    <a:prstGeom prst="rect"/>
+                  </pic:spPr>
+                </pic:pic>
+              </a:graphicData>
+            </a:graphic>
+          </wp:inline>
+        </w:drawing>
+      </w:r>
+      <w:r>
+        <w:t xml:space="preserve">  </w:t>
+      </w:r>
+      <w:r>
+        <w:drawing>
+          <wp:inline xmlns:a="http://schemas.openxmlformats.org/drawingml/2006/main" xmlns:pic="http://schemas.openxmlformats.org/drawingml/2006/picture">
+            <wp:extent cx="1737360" cy="3759825"/>
+            <wp:docPr id="1135014475" name="Picture 1135014475"/>
+            <wp:cNvGraphicFramePr>
+              <a:graphicFrameLocks noChangeAspect="1"/>
+            </wp:cNvGraphicFramePr>
+            <a:graphic>
+              <a:graphicData uri="http://schemas.openxmlformats.org/drawingml/2006/picture">
+                <pic:pic>
+                  <pic:nvPicPr>
+                    <pic:cNvPr id="0" name="ev7b-host-offline.png"/>
+                    <pic:cNvPicPr/>
+                  </pic:nvPicPr>
+                  <pic:blipFill>
+                    <a:blip r:embed="rId27"/>
+                    <a:stretch>
+                      <a:fillRect/>
+                    </a:stretch>
+                  </pic:blipFill>
+                  <pic:spPr>
+                    <a:xfrm>
+                      <a:off x="0" y="0"/>
+                      <a:ext cx="1737360" cy="3759825"/>
+                    </a:xfrm>
+                    <a:prstGeom prst="rect"/>
+                  </pic:spPr>
+                </pic:pic>
+              </a:graphicData>
+            </a:graphic>
+          </wp:inline>
+        </w:drawing>
+      </w:r>
+    </w:p>
+    <w:p>
+      <w:r>
+        <w:rPr>
+          <w:color w:val="556066"/>
+          <w:sz w:val="18"/>
+        </w:rPr>
+        <w:t>左：連不上房主時，15 秒內顯示原因，並建議改用同一個手機熱點（以前會一直停在「正在連線…」）。右：房主和配對伺服器暫時斷線時，房間和代碼都保留，顯示「暫時離線」並自動重連，已加入的人可以繼續玩。</w:t>
+      </w:r>
+    </w:p>
+    <w:p>
+      <w:pPr>
+        <w:keepNext/>
+      </w:pPr>
+      <w:r>
+        <w:rPr>
+          <w:b/>
+          <w:sz w:val="21"/>
+        </w:rPr>
+        <w:t>修改檔案清單（git diff）</w:t>
+      </w:r>
+    </w:p>
+    <w:p>
+      <w:r>
+        <w:drawing>
+          <wp:inline xmlns:a="http://schemas.openxmlformats.org/drawingml/2006/main" xmlns:pic="http://schemas.openxmlformats.org/drawingml/2006/picture">
+            <wp:extent cx="5852160" cy="2346836"/>
+            <wp:docPr id="1135014476" name="Picture 1135014476"/>
+            <wp:cNvGraphicFramePr>
+              <a:graphicFrameLocks noChangeAspect="1"/>
+            </wp:cNvGraphicFramePr>
+            <a:graphic>
+              <a:graphicData uri="http://schemas.openxmlformats.org/drawingml/2006/picture">
+                <pic:pic>
+                  <pic:nvPicPr>
+                    <pic:cNvPr id="0" name="ev7-diff.png"/>
+                    <pic:cNvPicPr/>
+                  </pic:nvPicPr>
+                  <pic:blipFill>
+                    <a:blip r:embed="rId28"/>
+                    <a:stretch>
+                      <a:fillRect/>
+                    </a:stretch>
+                  </pic:blipFill>
+                  <pic:spPr>
+                    <a:xfrm>
+                      <a:off x="0" y="0"/>
+                      <a:ext cx="5852160" cy="2346836"/>
+                    </a:xfrm>
+                    <a:prstGeom prst="rect"/>
+                  </pic:spPr>
+                </pic:pic>
+              </a:graphicData>
+            </a:graphic>
+          </wp:inline>
+        </w:drawing>
+      </w:r>
+    </w:p>
+    <w:p>
+      <w:r>
+        <w:rPr>
+          <w:color w:val="556066"/>
+          <w:sz w:val="18"/>
+        </w:rPr>
+        <w:t>main 與 feature/my-improvement 的差異。room.js／room.test.js 是新增的房間規則和測試，app.js 是連線和畫面；auction.js、investment.js 和它們的測試是組員 Shuoting93 加入的企業投資與商機競標。</w:t>
       </w:r>
     </w:p>
     <w:p>
@@ -5106,7 +5714,7 @@
               <w:rPr>
                 <w:sz w:val="18"/>
               </w:rPr>
-              <w:t>兩支手機在不同網路實機連線遊玩成功。實機測試時發現房主手機存著舊局就進不到選企業畫面，已改成單機和多人分開並修正。瀏覽器實際連線：大廳 19 個、模式分開 14 個、座位鎖定與接手 9 個情境全部通過。修正後還沒再用手機實測。</w:t>
+              <w:t>兩支手機在不同網路實機連線遊玩成功。實測發現的問題（手機存著舊局進不了選企業畫面、按拉霸後對局消失）都已修正。瀏覽器實際連線：大廳 19、模式分開 14、座位鎖定與接手 9、完整玩一季 6 項全部通過；組員加入投資與競標後重測，多人競標與投資 20 項也通過。</w:t>
             </w:r>
           </w:p>
         </w:tc>
@@ -5264,7 +5872,7 @@
               <w:rPr>
                 <w:sz w:val="18"/>
               </w:rPr>
-              <w:t>34 個測試全部通過；重新建置的 game.js 與提交的版本完全一致。</w:t>
+              <w:t>51 個測試全部通過（含組員的投資、競標測試與 100 局完整模擬）；重新建置的 game.js 與提交的版本完全一致。</w:t>
             </w:r>
           </w:p>
         </w:tc>
@@ -5319,6 +5927,76 @@
           <w:lang w:eastAsia="zh-TW"/>
         </w:rPr>
         <w:t xml:space="preserve"> 測試畫面輸出；若失敗，附修正前後的錯誤紀錄。</w:t>
+      </w:r>
+    </w:p>
+    <w:p>
+      <w:r>
+        <w:drawing>
+          <wp:inline xmlns:a="http://schemas.openxmlformats.org/drawingml/2006/main" xmlns:pic="http://schemas.openxmlformats.org/drawingml/2006/picture">
+            <wp:extent cx="5852160" cy="7583922"/>
+            <wp:docPr id="1135014477" name="Picture 1135014477"/>
+            <wp:cNvGraphicFramePr>
+              <a:graphicFrameLocks noChangeAspect="1"/>
+            </wp:cNvGraphicFramePr>
+            <a:graphic>
+              <a:graphicData uri="http://schemas.openxmlformats.org/drawingml/2006/picture">
+                <pic:pic>
+                  <pic:nvPicPr>
+                    <pic:cNvPr id="0" name="ev8-tests.png"/>
+                    <pic:cNvPicPr/>
+                  </pic:nvPicPr>
+                  <pic:blipFill>
+                    <a:blip r:embed="rId29"/>
+                    <a:stretch>
+                      <a:fillRect/>
+                    </a:stretch>
+                  </pic:blipFill>
+                  <pic:spPr>
+                    <a:xfrm>
+                      <a:off x="0" y="0"/>
+                      <a:ext cx="5852160" cy="7583922"/>
+                    </a:xfrm>
+                    <a:prstGeom prst="rect"/>
+                  </pic:spPr>
+                </pic:pic>
+              </a:graphicData>
+            </a:graphic>
+          </wp:inline>
+        </w:drawing>
+      </w:r>
+    </w:p>
+    <w:p>
+      <w:r>
+        <w:rPr>
+          <w:color w:val="556066"/>
+          <w:sz w:val="18"/>
+        </w:rPr>
+        <w:t>51 個自動化測試全部通過（含 100 局完整對局模擬）。最後一行 node build.mjs 之後 git status 沒有任何輸出，代表重新建置的 game.js、index.html 和提交的版本完全相同。</w:t>
+      </w:r>
+    </w:p>
+    <w:p>
+      <w:r>
+        <w:rPr>
+          <w:color w:val="556066"/>
+          <w:sz w:val="18"/>
+        </w:rPr>
+        <w:t>另外用 Playwright 開兩個瀏覽器，以真的 PeerJS 實際連線測試：選企業大廳 19 項、單機與多人分開 14 項、座位鎖定與接手 9 項、斷線恢復 9＋3 項、連線逾時 8 項、房間裡完整玩一季 6 項、多人競標與投資 20 項，全部通過。</w:t>
+      </w:r>
+    </w:p>
+    <w:p>
+      <w:r>
+        <w:rPr>
+          <w:b/>
+          <w:sz w:val="18"/>
+        </w:rPr>
+        <w:t>修正前後的錯誤紀錄：</w:t>
+      </w:r>
+      <w:r>
+        <w:rPr>
+          <w:color w:val="556066"/>
+          <w:sz w:val="18"/>
+        </w:rPr>
+        <w:t>連線逾時：修改前 8 項只過 2 項（畫面卡在「正在連線…」），修改後 8 項全過。房主斷線：修改前 9 項只過 2 項（房間被拆掉、訪客斷線），修改後 9 項全過。單機和多人分開後，實測發現房主按拉霸對局就消失：修正前的版本在「房間裡完整玩一季」只過 1 項，修正後 6 項全過。</w:t>
       </w:r>
     </w:p>
     <w:p>
@@ -5692,6 +6370,51 @@
       </w:r>
     </w:p>
     <w:p>
+      <w:r>
+        <w:drawing>
+          <wp:inline xmlns:a="http://schemas.openxmlformats.org/drawingml/2006/main" xmlns:pic="http://schemas.openxmlformats.org/drawingml/2006/picture">
+            <wp:extent cx="5852160" cy="2908165"/>
+            <wp:docPr id="1135014478" name="Picture 1135014478"/>
+            <wp:cNvGraphicFramePr>
+              <a:graphicFrameLocks noChangeAspect="1"/>
+            </wp:cNvGraphicFramePr>
+            <a:graphic>
+              <a:graphicData uri="http://schemas.openxmlformats.org/drawingml/2006/picture">
+                <pic:pic>
+                  <pic:nvPicPr>
+                    <pic:cNvPr id="0" name="ev9-log.png"/>
+                    <pic:cNvPicPr/>
+                  </pic:nvPicPr>
+                  <pic:blipFill>
+                    <a:blip r:embed="rId30"/>
+                    <a:stretch>
+                      <a:fillRect/>
+                    </a:stretch>
+                  </pic:blipFill>
+                  <pic:spPr>
+                    <a:xfrm>
+                      <a:off x="0" y="0"/>
+                      <a:ext cx="5852160" cy="2908165"/>
+                    </a:xfrm>
+                    <a:prstGeom prst="rect"/>
+                  </pic:spPr>
+                </pic:pic>
+              </a:graphicData>
+            </a:graphic>
+          </wp:inline>
+        </w:drawing>
+      </w:r>
+    </w:p>
+    <w:p>
+      <w:r>
+        <w:rPr>
+          <w:color w:val="556066"/>
+          <w:sz w:val="18"/>
+        </w:rPr>
+        <w:t>feature/my-improvement 比 main 多 21 個 commit，包括多人連線、連線修正、選企業大廳、單機與多人分開，以及組員的企業投資與商機競標（1694e09）。</w:t>
+      </w:r>
+    </w:p>
+    <w:p>
       <w:pPr>
         <w:spacing w:after="200" w:line="276" w:lineRule="auto"/>
         <w:rPr>
@@ -5840,7 +6563,7 @@
           <w:bCs/>
           <w:lang w:eastAsia="zh-TW"/>
         </w:rPr>
-        <w:t xml:space="preserve">請AI協助判斷 本次作業相對原始範本，增加了 約 35 % 的功能或改進</w:t>
+        <w:t>請AI協助判斷 本次作業相對原始範本，增加了 約 60 % 的功能或改進</w:t>
       </w:r>
     </w:p>
     <w:p>
@@ -5855,7 +6578,7 @@
           <w:rFonts w:eastAsia="新細明體" w:hint="eastAsia"/>
           <w:lang w:eastAsia="zh-TW"/>
         </w:rPr>
-        <w:t>AI 說明：以原始範本（main 分支 f66c429）為基準，不含自動產生的 game.js，程式與測試從約 150 KB 增加到約 203 KB（+35%）。遊戲規則（engine.js、data.js）沒有改動，增加的是一整個和單機分開的「多人連線」遊玩模式：房間代碼與邀請連結、WebRTC 點對點同步、進房自己選企業的大廳（房主隨時開始）、開始後座位鎖定與接手、連線逾時與房主斷線恢復、只看自己資料的淨資產排行，並新增 room.js 與 13 個單元測試。綜合程式量與功能，判斷約增加 35%。</w:t>
+        <w:t>AI 說明：以原始範本（main 分支 f66c429）為基準，不含自動產生的 game.js，程式與測試從約 150 KB 增加到約 240 KB（+60%），測試從 21 個增加到 51 個。原本的遊戲規則沒有改，增加的是：① 和單機分開的「多人連線」模式（房間代碼與邀請連結、WebRTC 點對點同步、進房自己選企業的大廳、座位鎖定與接手、連線逾時與房主斷線恢復、只看自己資料的淨資產排行），約 +35%；② 組員 Shuoting93 加入的企業投資卡與 14 種商機競標，約 +25%。綜合程式量與功能，判斷約增加 60%。</w:t>
       </w:r>
     </w:p>
     <w:p>
@@ -5870,20 +6593,18 @@
           <w:rFonts w:eastAsia="新細明體" w:hint="eastAsia"/>
           <w:lang w:eastAsia="zh-TW"/>
         </w:rPr>
-        <w:t>附上AI說明的截圖</w:t>
+        <w:t>附上AI說明的截圖：說明全文如上，由 Claude Code 依 git 統計整理，可用 git diff --stat main...feature/my-improvement 重現。</w:t>
       </w:r>
       <w:r>
         <w:rPr>
           <w:rFonts w:ascii="新細明體" w:eastAsia="新細明體" w:hAnsi="新細明體" w:cs="新細明體" w:hint="eastAsia"/>
           <w:lang w:eastAsia="zh-TW"/>
         </w:rPr>
-        <w:t>：</w:t>
-      </w:r>
-      <w:r>
-        <w:rPr>
-          <w:lang w:eastAsia="zh-TW"/>
-        </w:rPr>
-        <w:t>_______________________________________________________________</w:t>
+      </w:r>
+      <w:r>
+        <w:rPr>
+          <w:lang w:eastAsia="zh-TW"/>
+        </w:rPr>
       </w:r>
     </w:p>
     <w:p>
@@ -6063,6 +6784,26 @@
     <w:p>
       <w:r>
         <w:t>作答：</w:t>
+      </w:r>
+    </w:p>
+    <w:p>
+      <w:r>
+        <w:t>1. 一開始我以為 Fork 和 Clone 都只是「複製一份專案」，Commit 就是存檔、Push 就是上傳。實作後才分清楚：Fork 是在 GitHub 上把老師的範本複製到自己的帳號；Clone 是把自己的 Fork 下載到電腦，讓 Codex 修改；Commit 是在本機留下一筆有說明的版本，Push 才會送到 GitHub。我也學到 Pull Request 是用來比較兩條分支的差異：我們一度把功能分支合併進 main，後來發現作業要用 PR 看 main 和 feature/my-improvement 的差異，又把 main 退回原本的版本。</w:t>
+      </w:r>
+    </w:p>
+    <w:p>
+      <w:r>
+        <w:t>2. Codex 協助我讀懂原本的程式、寫 AGENTS.md，做出房間代碼和用代碼加入的第一版；後續再用 Claude Code 修正連線逾時和房主斷線，做出座位規則、選企業大廳、單機與多人分開，並寫測試、更新文件。需要我自己判斷的有：要不要加 TURN 中繼（需要把金鑰放在公開網頁，我決定不加）、座位規則（一人一台、選了就鎖定、全員入座才開始）、改成進房自己選企業、單機和多人要分開、畫面只顯示自己的資料和淨資產排行（和組員討論後決定）。很多問題是我用手機實測才發現的，例如同一支手機開兩個分頁連不上、手機存著舊局時進不了選企業畫面、按拉霸後對局消失，AI 的自動測試一開始都沒有抓到。</w:t>
+      </w:r>
+    </w:p>
+    <w:p>
+      <w:r>
+        <w:t>3. 下一步可以做：① 淘汰玩家的併吞規則（組員已經做了投資和商機競標，併吞還沒做）；② 玩家中途退出，讓他的公司改成無人經營，不用一直等人接手；③ 房主重新整理後能恢復房間和對局，目前房主一離開房間就結束了；④ 把瀏覽器自動測試放進 Repo，組員改程式後也能自己跑。原因是實際在課堂上玩時，最常遇到的是有人斷線或離開，這些都會讓整局卡住。</w:t>
+      </w:r>
+    </w:p>
+    <w:p>
+      <w:r>
+        <w:t>4. 自評約 60%：原作品只能在一台裝置輪流玩，現在多了每人一台手機的多人連線模式（含選企業大廳、斷線處理、只看自己資料的排行），加上組員做的企業投資與商機競標；原本的遊戲規則沒有改。程式量從約 150 KB 增加到約 240 KB，測試從 21 個增加到 51 個。</w:t>
       </w:r>
     </w:p>
     <w:p>

</xml_diff>